<commit_message>
Received - Sent RTCM with ring buffer.
</commit_message>
<xml_diff>
--- a/CPPNTRIPClient/Docs/StreamNTRIPClient.docx
+++ b/CPPNTRIPClient/Docs/StreamNTRIPClient.docx
@@ -7,7 +7,7 @@
         <w:pStyle w:val="Heading1"/>
         <w:jc w:val="center"/>
       </w:pPr>
-      <w:bookmarkStart w:id="0" w:name="_Toc227830666"/>
+      <w:bookmarkStart w:id="0" w:name="_Toc227832562"/>
       <w:r>
         <w:t>StreamNTRIPClient</w:t>
       </w:r>
@@ -17,7 +17,7 @@
       <w:pPr>
         <w:pStyle w:val="Heading1"/>
       </w:pPr>
-      <w:bookmarkStart w:id="1" w:name="_Toc227830667"/>
+      <w:bookmarkStart w:id="1" w:name="_Toc227832563"/>
       <w:r>
         <w:t>Lịch sử cập nhật</w:t>
       </w:r>
@@ -30,15 +30,15 @@
         <w:tblLook w:val="04A0" w:firstRow="1" w:lastRow="0" w:firstColumn="1" w:lastColumn="0" w:noHBand="0" w:noVBand="1"/>
       </w:tblPr>
       <w:tblGrid>
-        <w:gridCol w:w="2337"/>
-        <w:gridCol w:w="2337"/>
-        <w:gridCol w:w="2338"/>
-        <w:gridCol w:w="2338"/>
+        <w:gridCol w:w="1413"/>
+        <w:gridCol w:w="4111"/>
+        <w:gridCol w:w="2409"/>
+        <w:gridCol w:w="1417"/>
       </w:tblGrid>
       <w:tr>
         <w:tc>
           <w:tcPr>
-            <w:tcW w:w="2337" w:type="dxa"/>
+            <w:tcW w:w="1413" w:type="dxa"/>
           </w:tcPr>
           <w:p>
             <w:r>
@@ -48,7 +48,7 @@
         </w:tc>
         <w:tc>
           <w:tcPr>
-            <w:tcW w:w="2337" w:type="dxa"/>
+            <w:tcW w:w="4111" w:type="dxa"/>
           </w:tcPr>
           <w:p>
             <w:r>
@@ -58,7 +58,7 @@
         </w:tc>
         <w:tc>
           <w:tcPr>
-            <w:tcW w:w="2338" w:type="dxa"/>
+            <w:tcW w:w="2409" w:type="dxa"/>
           </w:tcPr>
           <w:p>
             <w:r>
@@ -68,7 +68,7 @@
         </w:tc>
         <w:tc>
           <w:tcPr>
-            <w:tcW w:w="2338" w:type="dxa"/>
+            <w:tcW w:w="1417" w:type="dxa"/>
           </w:tcPr>
           <w:p>
             <w:r>
@@ -80,7 +80,7 @@
       <w:tr>
         <w:tc>
           <w:tcPr>
-            <w:tcW w:w="2337" w:type="dxa"/>
+            <w:tcW w:w="1413" w:type="dxa"/>
           </w:tcPr>
           <w:p>
             <w:r>
@@ -90,47 +90,67 @@
         </w:tc>
         <w:tc>
           <w:tcPr>
-            <w:tcW w:w="2337" w:type="dxa"/>
+            <w:tcW w:w="4111" w:type="dxa"/>
+          </w:tcPr>
+          <w:p>
+            <w:r>
+              <w:t>Nhận RTCM</w:t>
+            </w:r>
+          </w:p>
+        </w:tc>
+        <w:tc>
+          <w:tcPr>
+            <w:tcW w:w="2409" w:type="dxa"/>
           </w:tcPr>
           <w:p/>
         </w:tc>
         <w:tc>
           <w:tcPr>
-            <w:tcW w:w="2338" w:type="dxa"/>
+            <w:tcW w:w="1417" w:type="dxa"/>
+          </w:tcPr>
+          <w:p>
+            <w:r>
+              <w:t>cvhuyen</w:t>
+            </w:r>
+          </w:p>
+        </w:tc>
+      </w:tr>
+      <w:tr>
+        <w:tc>
+          <w:tcPr>
+            <w:tcW w:w="1413" w:type="dxa"/>
+          </w:tcPr>
+          <w:p>
+            <w:r>
+              <w:t>1.1</w:t>
+            </w:r>
+          </w:p>
+        </w:tc>
+        <w:tc>
+          <w:tcPr>
+            <w:tcW w:w="4111" w:type="dxa"/>
+          </w:tcPr>
+          <w:p>
+            <w:r>
+              <w:t>Nhận – Gửi RTCM Đơn luồng</w:t>
+            </w:r>
+          </w:p>
+        </w:tc>
+        <w:tc>
+          <w:tcPr>
+            <w:tcW w:w="2409" w:type="dxa"/>
           </w:tcPr>
           <w:p/>
         </w:tc>
         <w:tc>
           <w:tcPr>
-            <w:tcW w:w="2338" w:type="dxa"/>
+            <w:tcW w:w="1417" w:type="dxa"/>
           </w:tcPr>
-          <w:p/>
-        </w:tc>
-      </w:tr>
-      <w:tr>
-        <w:tc>
-          <w:tcPr>
-            <w:tcW w:w="2337" w:type="dxa"/>
-          </w:tcPr>
-          <w:p/>
-        </w:tc>
-        <w:tc>
-          <w:tcPr>
-            <w:tcW w:w="2337" w:type="dxa"/>
-          </w:tcPr>
-          <w:p/>
-        </w:tc>
-        <w:tc>
-          <w:tcPr>
-            <w:tcW w:w="2338" w:type="dxa"/>
-          </w:tcPr>
-          <w:p/>
-        </w:tc>
-        <w:tc>
-          <w:tcPr>
-            <w:tcW w:w="2338" w:type="dxa"/>
-          </w:tcPr>
-          <w:p/>
+          <w:p>
+            <w:r>
+              <w:t>cvhuyen</w:t>
+            </w:r>
+          </w:p>
         </w:tc>
       </w:tr>
     </w:tbl>
@@ -139,7 +159,7 @@
       <w:pPr>
         <w:pStyle w:val="Heading1"/>
       </w:pPr>
-      <w:bookmarkStart w:id="2" w:name="_Toc227830668"/>
+      <w:bookmarkStart w:id="2" w:name="_Toc227832564"/>
       <w:r>
         <w:t>Mục lục</w:t>
       </w:r>
@@ -147,6 +167,14 @@
     </w:p>
     <w:sdt>
       <w:sdtPr>
+        <w:rPr>
+          <w:rFonts w:asciiTheme="minorHAnsi" w:eastAsiaTheme="minorHAnsi" w:hAnsiTheme="minorHAnsi" w:cstheme="minorBidi"/>
+          <w:color w:val="auto"/>
+          <w:kern w:val="2"/>
+          <w:sz w:val="24"/>
+          <w:szCs w:val="24"/>
+          <w14:ligatures w14:val="standardContextual"/>
+        </w:rPr>
         <w:id w:val="1274201900"/>
         <w:docPartObj>
           <w:docPartGallery w:val="Table of Contents"/>
@@ -155,15 +183,9 @@
       </w:sdtPr>
       <w:sdtEndPr>
         <w:rPr>
-          <w:rFonts w:asciiTheme="minorHAnsi" w:eastAsiaTheme="minorHAnsi" w:hAnsiTheme="minorHAnsi" w:cstheme="minorBidi"/>
           <w:b/>
           <w:bCs/>
           <w:noProof/>
-          <w:color w:val="auto"/>
-          <w:kern w:val="2"/>
-          <w:sz w:val="24"/>
-          <w:szCs w:val="24"/>
-          <w14:ligatures w14:val="standardContextual"/>
         </w:rPr>
       </w:sdtEndPr>
       <w:sdtContent>
@@ -195,7 +217,7 @@
           <w:r>
             <w:fldChar w:fldCharType="separate"/>
           </w:r>
-          <w:hyperlink w:anchor="_Toc227830666" w:history="1">
+          <w:hyperlink w:anchor="_Toc227832562" w:history="1">
             <w:r>
               <w:rPr>
                 <w:rStyle w:val="Hyperlink"/>
@@ -222,7 +244,7 @@
                 <w:noProof/>
                 <w:webHidden/>
               </w:rPr>
-              <w:instrText xml:space="preserve"> PAGEREF _Toc227830666 \h </w:instrText>
+              <w:instrText xml:space="preserve"> PAGEREF _Toc227832562 \h </w:instrText>
             </w:r>
             <w:r>
               <w:rPr>
@@ -264,7 +286,7 @@
               <w:noProof/>
             </w:rPr>
           </w:pPr>
-          <w:hyperlink w:anchor="_Toc227830667" w:history="1">
+          <w:hyperlink w:anchor="_Toc227832563" w:history="1">
             <w:r>
               <w:rPr>
                 <w:rStyle w:val="Hyperlink"/>
@@ -291,7 +313,7 @@
                 <w:noProof/>
                 <w:webHidden/>
               </w:rPr>
-              <w:instrText xml:space="preserve"> PAGEREF _Toc227830667 \h </w:instrText>
+              <w:instrText xml:space="preserve"> PAGEREF _Toc227832563 \h </w:instrText>
             </w:r>
             <w:r>
               <w:rPr>
@@ -333,7 +355,7 @@
               <w:noProof/>
             </w:rPr>
           </w:pPr>
-          <w:hyperlink w:anchor="_Toc227830668" w:history="1">
+          <w:hyperlink w:anchor="_Toc227832564" w:history="1">
             <w:r>
               <w:rPr>
                 <w:rStyle w:val="Hyperlink"/>
@@ -360,7 +382,7 @@
                 <w:noProof/>
                 <w:webHidden/>
               </w:rPr>
-              <w:instrText xml:space="preserve"> PAGEREF _Toc227830668 \h </w:instrText>
+              <w:instrText xml:space="preserve"> PAGEREF _Toc227832564 \h </w:instrText>
             </w:r>
             <w:r>
               <w:rPr>
@@ -395,6 +417,7 @@
           <w:pPr>
             <w:pStyle w:val="TOC1"/>
             <w:tabs>
+              <w:tab w:val="left" w:pos="480"/>
               <w:tab w:val="right" w:leader="dot" w:pos="9350"/>
             </w:tabs>
             <w:rPr>
@@ -402,12 +425,26 @@
               <w:noProof/>
             </w:rPr>
           </w:pPr>
-          <w:hyperlink w:anchor="_Toc227830669" w:history="1">
+          <w:hyperlink w:anchor="_Toc227832565" w:history="1">
             <w:r>
               <w:rPr>
                 <w:rStyle w:val="Hyperlink"/>
                 <w:noProof/>
               </w:rPr>
+              <w:t>1.</w:t>
+            </w:r>
+            <w:r>
+              <w:rPr>
+                <w:rFonts w:eastAsiaTheme="minorEastAsia"/>
+                <w:noProof/>
+              </w:rPr>
+              <w:tab/>
+            </w:r>
+            <w:r>
+              <w:rPr>
+                <w:rStyle w:val="Hyperlink"/>
+                <w:noProof/>
+              </w:rPr>
               <w:t>Cấu hình NTRIP server</w:t>
             </w:r>
             <w:r>
@@ -429,7 +466,7 @@
                 <w:noProof/>
                 <w:webHidden/>
               </w:rPr>
-              <w:instrText xml:space="preserve"> PAGEREF _Toc227830669 \h </w:instrText>
+              <w:instrText xml:space="preserve"> PAGEREF _Toc227832565 \h </w:instrText>
             </w:r>
             <w:r>
               <w:rPr>
@@ -464,6 +501,7 @@
           <w:pPr>
             <w:pStyle w:val="TOC1"/>
             <w:tabs>
+              <w:tab w:val="left" w:pos="480"/>
               <w:tab w:val="right" w:leader="dot" w:pos="9350"/>
             </w:tabs>
             <w:rPr>
@@ -471,12 +509,26 @@
               <w:noProof/>
             </w:rPr>
           </w:pPr>
-          <w:hyperlink w:anchor="_Toc227830670" w:history="1">
+          <w:hyperlink w:anchor="_Toc227832566" w:history="1">
             <w:r>
               <w:rPr>
                 <w:rStyle w:val="Hyperlink"/>
                 <w:noProof/>
               </w:rPr>
+              <w:t>2.</w:t>
+            </w:r>
+            <w:r>
+              <w:rPr>
+                <w:rFonts w:eastAsiaTheme="minorEastAsia"/>
+                <w:noProof/>
+              </w:rPr>
+              <w:tab/>
+            </w:r>
+            <w:r>
+              <w:rPr>
+                <w:rStyle w:val="Hyperlink"/>
+                <w:noProof/>
+              </w:rPr>
               <w:t>Nhận dữ liệu RTCM với chương trình StreamNTRIPClient</w:t>
             </w:r>
             <w:r>
@@ -498,7 +550,91 @@
                 <w:noProof/>
                 <w:webHidden/>
               </w:rPr>
-              <w:instrText xml:space="preserve"> PAGEREF _Toc227830670 \h </w:instrText>
+              <w:instrText xml:space="preserve"> PAGEREF _Toc227832566 \h </w:instrText>
+            </w:r>
+            <w:r>
+              <w:rPr>
+                <w:noProof/>
+                <w:webHidden/>
+              </w:rPr>
+            </w:r>
+            <w:r>
+              <w:rPr>
+                <w:noProof/>
+                <w:webHidden/>
+              </w:rPr>
+              <w:fldChar w:fldCharType="separate"/>
+            </w:r>
+            <w:r>
+              <w:rPr>
+                <w:noProof/>
+                <w:webHidden/>
+              </w:rPr>
+              <w:t>4</w:t>
+            </w:r>
+            <w:r>
+              <w:rPr>
+                <w:noProof/>
+                <w:webHidden/>
+              </w:rPr>
+              <w:fldChar w:fldCharType="end"/>
+            </w:r>
+          </w:hyperlink>
+        </w:p>
+        <w:p>
+          <w:pPr>
+            <w:pStyle w:val="TOC1"/>
+            <w:tabs>
+              <w:tab w:val="left" w:pos="480"/>
+              <w:tab w:val="right" w:leader="dot" w:pos="9350"/>
+            </w:tabs>
+            <w:rPr>
+              <w:rFonts w:eastAsiaTheme="minorEastAsia"/>
+              <w:noProof/>
+            </w:rPr>
+          </w:pPr>
+          <w:hyperlink w:anchor="_Toc227832567" w:history="1">
+            <w:r>
+              <w:rPr>
+                <w:rStyle w:val="Hyperlink"/>
+                <w:noProof/>
+              </w:rPr>
+              <w:t>3.</w:t>
+            </w:r>
+            <w:r>
+              <w:rPr>
+                <w:rFonts w:eastAsiaTheme="minorEastAsia"/>
+                <w:noProof/>
+              </w:rPr>
+              <w:tab/>
+            </w:r>
+            <w:r>
+              <w:rPr>
+                <w:rStyle w:val="Hyperlink"/>
+                <w:noProof/>
+              </w:rPr>
+              <w:t>Nhận – Gửi dữ liệu RTCM đơn luồng với chương trình StreamNTRIPClient</w:t>
+            </w:r>
+            <w:r>
+              <w:rPr>
+                <w:noProof/>
+                <w:webHidden/>
+              </w:rPr>
+              <w:tab/>
+            </w:r>
+            <w:r>
+              <w:rPr>
+                <w:noProof/>
+                <w:webHidden/>
+              </w:rPr>
+              <w:fldChar w:fldCharType="begin"/>
+            </w:r>
+            <w:r>
+              <w:rPr>
+                <w:noProof/>
+                <w:webHidden/>
+              </w:rPr>
+              <w:instrText xml:space="preserve"> PAGEREF _Toc227832567 \h </w:instrText>
             </w:r>
             <w:r>
               <w:rPr>
@@ -555,7 +691,7 @@
           <w:numId w:val="2"/>
         </w:numPr>
       </w:pPr>
-      <w:bookmarkStart w:id="3" w:name="_Toc227830669"/>
+      <w:bookmarkStart w:id="3" w:name="_Toc227832565"/>
       <w:r>
         <w:t>Cấu hình NTRIP server</w:t>
       </w:r>
@@ -809,7 +945,7 @@
           <w:numId w:val="2"/>
         </w:numPr>
       </w:pPr>
-      <w:bookmarkStart w:id="4" w:name="_Toc227830670"/>
+      <w:bookmarkStart w:id="4" w:name="_Toc227832566"/>
       <w:r>
         <w:lastRenderedPageBreak/>
         <w:t xml:space="preserve">Nhận dữ liệu RTCM với chương trình </w:t>
@@ -875,6 +1011,82 @@
       </w:r>
       <w:r>
         <w:t>ấn q/Q + Enter</w:t>
+      </w:r>
+    </w:p>
+    <w:p>
+      <w:pPr>
+        <w:pStyle w:val="Heading1"/>
+        <w:numPr>
+          <w:ilvl w:val="0"/>
+          <w:numId w:val="2"/>
+        </w:numPr>
+      </w:pPr>
+      <w:bookmarkStart w:id="5" w:name="_Toc227832567"/>
+      <w:r>
+        <w:t xml:space="preserve">Nhận </w:t>
+      </w:r>
+      <w:r>
+        <w:t xml:space="preserve">– Gửi dữ liệu </w:t>
+      </w:r>
+      <w:r>
+        <w:t>RTCM</w:t>
+      </w:r>
+      <w:r>
+        <w:t xml:space="preserve"> đơn luồng </w:t>
+      </w:r>
+      <w:r>
+        <w:t xml:space="preserve">với chương trình </w:t>
+      </w:r>
+      <w:r>
+        <w:t>StreamNTRIPClient</w:t>
+      </w:r>
+      <w:bookmarkEnd w:id="5"/>
+    </w:p>
+    <w:p/>
+    <w:p>
+      <w:pPr>
+        <w:ind w:left="360"/>
+      </w:pPr>
+      <w:r>
+        <w:rPr>
+          <w:noProof/>
+        </w:rPr>
+        <w:lastRenderedPageBreak/>
+        <w:drawing>
+          <wp:inline distT="0" distB="0" distL="0" distR="0" wp14:anchorId="3A8941D8" wp14:editId="5D95959C">
+            <wp:extent cx="5943600" cy="3343275"/>
+            <wp:effectExtent l="0" t="0" r="0" b="9525"/>
+            <wp:docPr id="55383605" name="Picture 1"/>
+            <wp:cNvGraphicFramePr>
+              <a:graphicFrameLocks xmlns:a="http://schemas.openxmlformats.org/drawingml/2006/main" noChangeAspect="1"/>
+            </wp:cNvGraphicFramePr>
+            <a:graphic xmlns:a="http://schemas.openxmlformats.org/drawingml/2006/main">
+              <a:graphicData uri="http://schemas.openxmlformats.org/drawingml/2006/picture">
+                <pic:pic xmlns:pic="http://schemas.openxmlformats.org/drawingml/2006/picture">
+                  <pic:nvPicPr>
+                    <pic:cNvPr id="55383605" name=""/>
+                    <pic:cNvPicPr/>
+                  </pic:nvPicPr>
+                  <pic:blipFill>
+                    <a:blip r:embed="rId10"/>
+                    <a:stretch>
+                      <a:fillRect/>
+                    </a:stretch>
+                  </pic:blipFill>
+                  <pic:spPr>
+                    <a:xfrm>
+                      <a:off x="0" y="0"/>
+                      <a:ext cx="5943600" cy="3343275"/>
+                    </a:xfrm>
+                    <a:prstGeom prst="rect">
+                      <a:avLst/>
+                    </a:prstGeom>
+                  </pic:spPr>
+                </pic:pic>
+              </a:graphicData>
+            </a:graphic>
+          </wp:inline>
+        </w:drawing>
       </w:r>
     </w:p>
     <w:sectPr>

</xml_diff>

<commit_message>
Version 1.2       Nhận RTCM từ NTRIP server – Gửi dữ liệu RTCM qua MQTT broker
</commit_message>
<xml_diff>
--- a/CPPNTRIPClient/Docs/StreamNTRIPClient.docx
+++ b/CPPNTRIPClient/Docs/StreamNTRIPClient.docx
@@ -7,7 +7,7 @@
         <w:pStyle w:val="Heading1"/>
         <w:jc w:val="center"/>
       </w:pPr>
-      <w:bookmarkStart w:id="0" w:name="_Toc227832562"/>
+      <w:bookmarkStart w:id="0" w:name="_Toc228455143"/>
       <w:r>
         <w:t>StreamNTRIPClient</w:t>
       </w:r>
@@ -17,7 +17,7 @@
       <w:pPr>
         <w:pStyle w:val="Heading1"/>
       </w:pPr>
-      <w:bookmarkStart w:id="1" w:name="_Toc227832563"/>
+      <w:bookmarkStart w:id="1" w:name="_Toc228455144"/>
       <w:r>
         <w:t>Lịch sử cập nhật</w:t>
       </w:r>
@@ -153,13 +153,58 @@
           </w:p>
         </w:tc>
       </w:tr>
+      <w:tr>
+        <w:tc>
+          <w:tcPr>
+            <w:tcW w:w="1413" w:type="dxa"/>
+          </w:tcPr>
+          <w:p>
+            <w:r>
+              <w:t>1.2</w:t>
+            </w:r>
+          </w:p>
+        </w:tc>
+        <w:tc>
+          <w:tcPr>
+            <w:tcW w:w="4111" w:type="dxa"/>
+          </w:tcPr>
+          <w:p>
+            <w:r>
+              <w:t xml:space="preserve">Nhận – Gửi RTCM </w:t>
+            </w:r>
+            <w:r>
+              <w:t>đơn luồng đến</w:t>
+            </w:r>
+            <w:r>
+              <w:t xml:space="preserve"> MQTT broker</w:t>
+            </w:r>
+          </w:p>
+          <w:p/>
+        </w:tc>
+        <w:tc>
+          <w:tcPr>
+            <w:tcW w:w="2409" w:type="dxa"/>
+          </w:tcPr>
+          <w:p/>
+        </w:tc>
+        <w:tc>
+          <w:tcPr>
+            <w:tcW w:w="1417" w:type="dxa"/>
+          </w:tcPr>
+          <w:p>
+            <w:r>
+              <w:t>cvhuyen</w:t>
+            </w:r>
+          </w:p>
+        </w:tc>
+      </w:tr>
     </w:tbl>
     <w:p/>
     <w:p>
       <w:pPr>
         <w:pStyle w:val="Heading1"/>
       </w:pPr>
-      <w:bookmarkStart w:id="2" w:name="_Toc227832564"/>
+      <w:bookmarkStart w:id="2" w:name="_Toc228455145"/>
       <w:r>
         <w:t>Mục lục</w:t>
       </w:r>
@@ -217,7 +262,7 @@
           <w:r>
             <w:fldChar w:fldCharType="separate"/>
           </w:r>
-          <w:hyperlink w:anchor="_Toc227832562" w:history="1">
+          <w:hyperlink w:anchor="_Toc228455143" w:history="1">
             <w:r>
               <w:rPr>
                 <w:rStyle w:val="Hyperlink"/>
@@ -244,7 +289,7 @@
                 <w:noProof/>
                 <w:webHidden/>
               </w:rPr>
-              <w:instrText xml:space="preserve"> PAGEREF _Toc227832562 \h </w:instrText>
+              <w:instrText xml:space="preserve"> PAGEREF _Toc228455143 \h </w:instrText>
             </w:r>
             <w:r>
               <w:rPr>
@@ -286,7 +331,7 @@
               <w:noProof/>
             </w:rPr>
           </w:pPr>
-          <w:hyperlink w:anchor="_Toc227832563" w:history="1">
+          <w:hyperlink w:anchor="_Toc228455144" w:history="1">
             <w:r>
               <w:rPr>
                 <w:rStyle w:val="Hyperlink"/>
@@ -313,7 +358,7 @@
                 <w:noProof/>
                 <w:webHidden/>
               </w:rPr>
-              <w:instrText xml:space="preserve"> PAGEREF _Toc227832563 \h </w:instrText>
+              <w:instrText xml:space="preserve"> PAGEREF _Toc228455144 \h </w:instrText>
             </w:r>
             <w:r>
               <w:rPr>
@@ -355,7 +400,7 @@
               <w:noProof/>
             </w:rPr>
           </w:pPr>
-          <w:hyperlink w:anchor="_Toc227832564" w:history="1">
+          <w:hyperlink w:anchor="_Toc228455145" w:history="1">
             <w:r>
               <w:rPr>
                 <w:rStyle w:val="Hyperlink"/>
@@ -382,7 +427,7 @@
                 <w:noProof/>
                 <w:webHidden/>
               </w:rPr>
-              <w:instrText xml:space="preserve"> PAGEREF _Toc227832564 \h </w:instrText>
+              <w:instrText xml:space="preserve"> PAGEREF _Toc228455145 \h </w:instrText>
             </w:r>
             <w:r>
               <w:rPr>
@@ -425,7 +470,7 @@
               <w:noProof/>
             </w:rPr>
           </w:pPr>
-          <w:hyperlink w:anchor="_Toc227832565" w:history="1">
+          <w:hyperlink w:anchor="_Toc228455146" w:history="1">
             <w:r>
               <w:rPr>
                 <w:rStyle w:val="Hyperlink"/>
@@ -466,7 +511,7 @@
                 <w:noProof/>
                 <w:webHidden/>
               </w:rPr>
-              <w:instrText xml:space="preserve"> PAGEREF _Toc227832565 \h </w:instrText>
+              <w:instrText xml:space="preserve"> PAGEREF _Toc228455146 \h </w:instrText>
             </w:r>
             <w:r>
               <w:rPr>
@@ -509,7 +554,7 @@
               <w:noProof/>
             </w:rPr>
           </w:pPr>
-          <w:hyperlink w:anchor="_Toc227832566" w:history="1">
+          <w:hyperlink w:anchor="_Toc228455147" w:history="1">
             <w:r>
               <w:rPr>
                 <w:rStyle w:val="Hyperlink"/>
@@ -550,7 +595,7 @@
                 <w:noProof/>
                 <w:webHidden/>
               </w:rPr>
-              <w:instrText xml:space="preserve"> PAGEREF _Toc227832566 \h </w:instrText>
+              <w:instrText xml:space="preserve"> PAGEREF _Toc228455147 \h </w:instrText>
             </w:r>
             <w:r>
               <w:rPr>
@@ -593,7 +638,7 @@
               <w:noProof/>
             </w:rPr>
           </w:pPr>
-          <w:hyperlink w:anchor="_Toc227832567" w:history="1">
+          <w:hyperlink w:anchor="_Toc228455148" w:history="1">
             <w:r>
               <w:rPr>
                 <w:rStyle w:val="Hyperlink"/>
@@ -634,7 +679,7 @@
                 <w:noProof/>
                 <w:webHidden/>
               </w:rPr>
-              <w:instrText xml:space="preserve"> PAGEREF _Toc227832567 \h </w:instrText>
+              <w:instrText xml:space="preserve"> PAGEREF _Toc228455148 \h </w:instrText>
             </w:r>
             <w:r>
               <w:rPr>
@@ -655,6 +700,465 @@
                 <w:webHidden/>
               </w:rPr>
               <w:t>4</w:t>
+            </w:r>
+            <w:r>
+              <w:rPr>
+                <w:noProof/>
+                <w:webHidden/>
+              </w:rPr>
+              <w:fldChar w:fldCharType="end"/>
+            </w:r>
+          </w:hyperlink>
+        </w:p>
+        <w:p>
+          <w:pPr>
+            <w:pStyle w:val="TOC1"/>
+            <w:tabs>
+              <w:tab w:val="left" w:pos="480"/>
+              <w:tab w:val="right" w:leader="dot" w:pos="9350"/>
+            </w:tabs>
+            <w:rPr>
+              <w:rFonts w:eastAsiaTheme="minorEastAsia"/>
+              <w:noProof/>
+            </w:rPr>
+          </w:pPr>
+          <w:hyperlink w:anchor="_Toc228455149" w:history="1">
+            <w:r>
+              <w:rPr>
+                <w:rStyle w:val="Hyperlink"/>
+                <w:noProof/>
+              </w:rPr>
+              <w:t>4.</w:t>
+            </w:r>
+            <w:r>
+              <w:rPr>
+                <w:rFonts w:eastAsiaTheme="minorEastAsia"/>
+                <w:noProof/>
+              </w:rPr>
+              <w:tab/>
+            </w:r>
+            <w:r>
+              <w:rPr>
+                <w:rStyle w:val="Hyperlink"/>
+                <w:noProof/>
+              </w:rPr>
+              <w:t>Nhận – Gửi dữ liệu RTCM qua MQTT broker với chương trình StreamNTRIPClient</w:t>
+            </w:r>
+            <w:r>
+              <w:rPr>
+                <w:noProof/>
+                <w:webHidden/>
+              </w:rPr>
+              <w:tab/>
+            </w:r>
+            <w:r>
+              <w:rPr>
+                <w:noProof/>
+                <w:webHidden/>
+              </w:rPr>
+              <w:fldChar w:fldCharType="begin"/>
+            </w:r>
+            <w:r>
+              <w:rPr>
+                <w:noProof/>
+                <w:webHidden/>
+              </w:rPr>
+              <w:instrText xml:space="preserve"> PAGEREF _Toc228455149 \h </w:instrText>
+            </w:r>
+            <w:r>
+              <w:rPr>
+                <w:noProof/>
+                <w:webHidden/>
+              </w:rPr>
+            </w:r>
+            <w:r>
+              <w:rPr>
+                <w:noProof/>
+                <w:webHidden/>
+              </w:rPr>
+              <w:fldChar w:fldCharType="separate"/>
+            </w:r>
+            <w:r>
+              <w:rPr>
+                <w:noProof/>
+                <w:webHidden/>
+              </w:rPr>
+              <w:t>5</w:t>
+            </w:r>
+            <w:r>
+              <w:rPr>
+                <w:noProof/>
+                <w:webHidden/>
+              </w:rPr>
+              <w:fldChar w:fldCharType="end"/>
+            </w:r>
+          </w:hyperlink>
+        </w:p>
+        <w:p>
+          <w:pPr>
+            <w:pStyle w:val="TOC2"/>
+            <w:tabs>
+              <w:tab w:val="right" w:leader="dot" w:pos="9350"/>
+            </w:tabs>
+            <w:rPr>
+              <w:rFonts w:eastAsiaTheme="minorEastAsia"/>
+              <w:noProof/>
+            </w:rPr>
+          </w:pPr>
+          <w:hyperlink w:anchor="_Toc228455150" w:history="1">
+            <w:r>
+              <w:rPr>
+                <w:rStyle w:val="Hyperlink"/>
+                <w:noProof/>
+              </w:rPr>
+              <w:t>4.1 Tham số MQTT broker:</w:t>
+            </w:r>
+            <w:r>
+              <w:rPr>
+                <w:noProof/>
+                <w:webHidden/>
+              </w:rPr>
+              <w:tab/>
+            </w:r>
+            <w:r>
+              <w:rPr>
+                <w:noProof/>
+                <w:webHidden/>
+              </w:rPr>
+              <w:fldChar w:fldCharType="begin"/>
+            </w:r>
+            <w:r>
+              <w:rPr>
+                <w:noProof/>
+                <w:webHidden/>
+              </w:rPr>
+              <w:instrText xml:space="preserve"> PAGEREF _Toc228455150 \h </w:instrText>
+            </w:r>
+            <w:r>
+              <w:rPr>
+                <w:noProof/>
+                <w:webHidden/>
+              </w:rPr>
+            </w:r>
+            <w:r>
+              <w:rPr>
+                <w:noProof/>
+                <w:webHidden/>
+              </w:rPr>
+              <w:fldChar w:fldCharType="separate"/>
+            </w:r>
+            <w:r>
+              <w:rPr>
+                <w:noProof/>
+                <w:webHidden/>
+              </w:rPr>
+              <w:t>5</w:t>
+            </w:r>
+            <w:r>
+              <w:rPr>
+                <w:noProof/>
+                <w:webHidden/>
+              </w:rPr>
+              <w:fldChar w:fldCharType="end"/>
+            </w:r>
+          </w:hyperlink>
+        </w:p>
+        <w:p>
+          <w:pPr>
+            <w:pStyle w:val="TOC2"/>
+            <w:tabs>
+              <w:tab w:val="left" w:pos="960"/>
+              <w:tab w:val="right" w:leader="dot" w:pos="9350"/>
+            </w:tabs>
+            <w:rPr>
+              <w:rFonts w:eastAsiaTheme="minorEastAsia"/>
+              <w:noProof/>
+            </w:rPr>
+          </w:pPr>
+          <w:hyperlink w:anchor="_Toc228455151" w:history="1">
+            <w:r>
+              <w:rPr>
+                <w:rStyle w:val="Hyperlink"/>
+                <w:noProof/>
+              </w:rPr>
+              <w:t>4.2</w:t>
+            </w:r>
+            <w:r>
+              <w:rPr>
+                <w:rFonts w:eastAsiaTheme="minorEastAsia"/>
+                <w:noProof/>
+              </w:rPr>
+              <w:tab/>
+            </w:r>
+            <w:r>
+              <w:rPr>
+                <w:rStyle w:val="Hyperlink"/>
+                <w:noProof/>
+              </w:rPr>
+              <w:t>MQTT client with GUI</w:t>
+            </w:r>
+            <w:r>
+              <w:rPr>
+                <w:noProof/>
+                <w:webHidden/>
+              </w:rPr>
+              <w:tab/>
+            </w:r>
+            <w:r>
+              <w:rPr>
+                <w:noProof/>
+                <w:webHidden/>
+              </w:rPr>
+              <w:fldChar w:fldCharType="begin"/>
+            </w:r>
+            <w:r>
+              <w:rPr>
+                <w:noProof/>
+                <w:webHidden/>
+              </w:rPr>
+              <w:instrText xml:space="preserve"> PAGEREF _Toc228455151 \h </w:instrText>
+            </w:r>
+            <w:r>
+              <w:rPr>
+                <w:noProof/>
+                <w:webHidden/>
+              </w:rPr>
+            </w:r>
+            <w:r>
+              <w:rPr>
+                <w:noProof/>
+                <w:webHidden/>
+              </w:rPr>
+              <w:fldChar w:fldCharType="separate"/>
+            </w:r>
+            <w:r>
+              <w:rPr>
+                <w:noProof/>
+                <w:webHidden/>
+              </w:rPr>
+              <w:t>5</w:t>
+            </w:r>
+            <w:r>
+              <w:rPr>
+                <w:noProof/>
+                <w:webHidden/>
+              </w:rPr>
+              <w:fldChar w:fldCharType="end"/>
+            </w:r>
+          </w:hyperlink>
+        </w:p>
+        <w:p>
+          <w:pPr>
+            <w:pStyle w:val="TOC2"/>
+            <w:tabs>
+              <w:tab w:val="left" w:pos="960"/>
+              <w:tab w:val="right" w:leader="dot" w:pos="9350"/>
+            </w:tabs>
+            <w:rPr>
+              <w:rFonts w:eastAsiaTheme="minorEastAsia"/>
+              <w:noProof/>
+            </w:rPr>
+          </w:pPr>
+          <w:hyperlink w:anchor="_Toc228455152" w:history="1">
+            <w:r>
+              <w:rPr>
+                <w:rStyle w:val="Hyperlink"/>
+                <w:noProof/>
+              </w:rPr>
+              <w:t>4.3</w:t>
+            </w:r>
+            <w:r>
+              <w:rPr>
+                <w:rFonts w:eastAsiaTheme="minorEastAsia"/>
+                <w:noProof/>
+              </w:rPr>
+              <w:tab/>
+            </w:r>
+            <w:r>
+              <w:rPr>
+                <w:rStyle w:val="Hyperlink"/>
+                <w:noProof/>
+              </w:rPr>
+              <w:t>Paho MQTT C library – VS2022</w:t>
+            </w:r>
+            <w:r>
+              <w:rPr>
+                <w:noProof/>
+                <w:webHidden/>
+              </w:rPr>
+              <w:tab/>
+            </w:r>
+            <w:r>
+              <w:rPr>
+                <w:noProof/>
+                <w:webHidden/>
+              </w:rPr>
+              <w:fldChar w:fldCharType="begin"/>
+            </w:r>
+            <w:r>
+              <w:rPr>
+                <w:noProof/>
+                <w:webHidden/>
+              </w:rPr>
+              <w:instrText xml:space="preserve"> PAGEREF _Toc228455152 \h </w:instrText>
+            </w:r>
+            <w:r>
+              <w:rPr>
+                <w:noProof/>
+                <w:webHidden/>
+              </w:rPr>
+            </w:r>
+            <w:r>
+              <w:rPr>
+                <w:noProof/>
+                <w:webHidden/>
+              </w:rPr>
+              <w:fldChar w:fldCharType="separate"/>
+            </w:r>
+            <w:r>
+              <w:rPr>
+                <w:noProof/>
+                <w:webHidden/>
+              </w:rPr>
+              <w:t>6</w:t>
+            </w:r>
+            <w:r>
+              <w:rPr>
+                <w:noProof/>
+                <w:webHidden/>
+              </w:rPr>
+              <w:fldChar w:fldCharType="end"/>
+            </w:r>
+          </w:hyperlink>
+        </w:p>
+        <w:p>
+          <w:pPr>
+            <w:pStyle w:val="TOC2"/>
+            <w:tabs>
+              <w:tab w:val="right" w:leader="dot" w:pos="9350"/>
+            </w:tabs>
+            <w:rPr>
+              <w:rFonts w:eastAsiaTheme="minorEastAsia"/>
+              <w:noProof/>
+            </w:rPr>
+          </w:pPr>
+          <w:hyperlink w:anchor="_Toc228455153" w:history="1">
+            <w:r>
+              <w:rPr>
+                <w:rStyle w:val="Hyperlink"/>
+                <w:noProof/>
+              </w:rPr>
+              <w:t>4.4 Tạo thư mục install Paho MQTT C</w:t>
+            </w:r>
+            <w:r>
+              <w:rPr>
+                <w:noProof/>
+                <w:webHidden/>
+              </w:rPr>
+              <w:tab/>
+            </w:r>
+            <w:r>
+              <w:rPr>
+                <w:noProof/>
+                <w:webHidden/>
+              </w:rPr>
+              <w:fldChar w:fldCharType="begin"/>
+            </w:r>
+            <w:r>
+              <w:rPr>
+                <w:noProof/>
+                <w:webHidden/>
+              </w:rPr>
+              <w:instrText xml:space="preserve"> PAGEREF _Toc228455153 \h </w:instrText>
+            </w:r>
+            <w:r>
+              <w:rPr>
+                <w:noProof/>
+                <w:webHidden/>
+              </w:rPr>
+            </w:r>
+            <w:r>
+              <w:rPr>
+                <w:noProof/>
+                <w:webHidden/>
+              </w:rPr>
+              <w:fldChar w:fldCharType="separate"/>
+            </w:r>
+            <w:r>
+              <w:rPr>
+                <w:noProof/>
+                <w:webHidden/>
+              </w:rPr>
+              <w:t>7</w:t>
+            </w:r>
+            <w:r>
+              <w:rPr>
+                <w:noProof/>
+                <w:webHidden/>
+              </w:rPr>
+              <w:fldChar w:fldCharType="end"/>
+            </w:r>
+          </w:hyperlink>
+        </w:p>
+        <w:p>
+          <w:pPr>
+            <w:pStyle w:val="TOC2"/>
+            <w:tabs>
+              <w:tab w:val="right" w:leader="dot" w:pos="9350"/>
+            </w:tabs>
+            <w:rPr>
+              <w:rFonts w:eastAsiaTheme="minorEastAsia"/>
+              <w:noProof/>
+            </w:rPr>
+          </w:pPr>
+          <w:hyperlink w:anchor="_Toc228455154" w:history="1">
+            <w:r>
+              <w:rPr>
+                <w:rStyle w:val="Hyperlink"/>
+                <w:noProof/>
+              </w:rPr>
+              <w:t>4.5 Paho MQTT với các ngôn ngữ lập trình khác</w:t>
+            </w:r>
+            <w:r>
+              <w:rPr>
+                <w:noProof/>
+                <w:webHidden/>
+              </w:rPr>
+              <w:tab/>
+            </w:r>
+            <w:r>
+              <w:rPr>
+                <w:noProof/>
+                <w:webHidden/>
+              </w:rPr>
+              <w:fldChar w:fldCharType="begin"/>
+            </w:r>
+            <w:r>
+              <w:rPr>
+                <w:noProof/>
+                <w:webHidden/>
+              </w:rPr>
+              <w:instrText xml:space="preserve"> PAGEREF _Toc228455154 \h </w:instrText>
+            </w:r>
+            <w:r>
+              <w:rPr>
+                <w:noProof/>
+                <w:webHidden/>
+              </w:rPr>
+            </w:r>
+            <w:r>
+              <w:rPr>
+                <w:noProof/>
+                <w:webHidden/>
+              </w:rPr>
+              <w:fldChar w:fldCharType="separate"/>
+            </w:r>
+            <w:r>
+              <w:rPr>
+                <w:noProof/>
+                <w:webHidden/>
+              </w:rPr>
+              <w:t>9</w:t>
             </w:r>
             <w:r>
               <w:rPr>
@@ -691,7 +1195,7 @@
           <w:numId w:val="2"/>
         </w:numPr>
       </w:pPr>
-      <w:bookmarkStart w:id="3" w:name="_Toc227832565"/>
+      <w:bookmarkStart w:id="3" w:name="_Toc228455146"/>
       <w:r>
         <w:t>Cấu hình NTRIP server</w:t>
       </w:r>
@@ -945,7 +1449,7 @@
           <w:numId w:val="2"/>
         </w:numPr>
       </w:pPr>
-      <w:bookmarkStart w:id="4" w:name="_Toc227832566"/>
+      <w:bookmarkStart w:id="4" w:name="_Toc228455147"/>
       <w:r>
         <w:lastRenderedPageBreak/>
         <w:t xml:space="preserve">Nhận dữ liệu RTCM với chương trình </w:t>
@@ -1021,21 +1525,9 @@
           <w:numId w:val="2"/>
         </w:numPr>
       </w:pPr>
-      <w:bookmarkStart w:id="5" w:name="_Toc227832567"/>
-      <w:r>
-        <w:t xml:space="preserve">Nhận </w:t>
-      </w:r>
-      <w:r>
-        <w:t xml:space="preserve">– Gửi dữ liệu </w:t>
-      </w:r>
-      <w:r>
-        <w:t>RTCM</w:t>
-      </w:r>
-      <w:r>
-        <w:t xml:space="preserve"> đơn luồng </w:t>
-      </w:r>
-      <w:r>
-        <w:t xml:space="preserve">với chương trình </w:t>
+      <w:bookmarkStart w:id="5" w:name="_Toc228455148"/>
+      <w:r>
+        <w:t xml:space="preserve">Nhận – Gửi dữ liệu RTCM đơn luồng với chương trình </w:t>
       </w:r>
       <w:r>
         <w:t>StreamNTRIPClient</w:t>
@@ -1089,6 +1581,892 @@
         </w:drawing>
       </w:r>
     </w:p>
+    <w:p>
+      <w:pPr>
+        <w:pStyle w:val="Heading1"/>
+        <w:numPr>
+          <w:ilvl w:val="0"/>
+          <w:numId w:val="2"/>
+        </w:numPr>
+      </w:pPr>
+      <w:bookmarkStart w:id="6" w:name="_Toc228455149"/>
+      <w:r>
+        <w:t xml:space="preserve">Nhận – Gửi RTCM </w:t>
+      </w:r>
+      <w:r>
+        <w:t xml:space="preserve">đến </w:t>
+      </w:r>
+      <w:r>
+        <w:t xml:space="preserve">MQTT broker </w:t>
+      </w:r>
+      <w:r>
+        <w:t xml:space="preserve">với chương trình </w:t>
+      </w:r>
+      <w:r>
+        <w:t>StreamNTRIPClient</w:t>
+      </w:r>
+      <w:bookmarkEnd w:id="6"/>
+    </w:p>
+    <w:p>
+      <w:pPr>
+        <w:pStyle w:val="Heading2"/>
+      </w:pPr>
+      <w:bookmarkStart w:id="7" w:name="_Toc228455150"/>
+      <w:r>
+        <w:t>4.1 Tham số MQTT broker:</w:t>
+      </w:r>
+      <w:bookmarkEnd w:id="7"/>
+    </w:p>
+    <w:p>
+      <w:r>
+        <w:t>Host: mqtt://broker.freemqtt.com</w:t>
+      </w:r>
+    </w:p>
+    <w:p>
+      <w:r>
+        <w:t>Port (TCP):</w:t>
+      </w:r>
+      <w:r>
+        <w:t xml:space="preserve"> </w:t>
+      </w:r>
+      <w:r>
+        <w:t>1883</w:t>
+      </w:r>
+    </w:p>
+    <w:p>
+      <w:r>
+        <w:t>Username:</w:t>
+      </w:r>
+      <w:r>
+        <w:t xml:space="preserve"> </w:t>
+      </w:r>
+      <w:r>
+        <w:t>freemqtt</w:t>
+      </w:r>
+    </w:p>
+    <w:p>
+      <w:r>
+        <w:t>Password:</w:t>
+      </w:r>
+      <w:r>
+        <w:t xml:space="preserve"> </w:t>
+      </w:r>
+      <w:r>
+        <w:t>public</w:t>
+      </w:r>
+    </w:p>
+    <w:p>
+      <w:r>
+        <w:t>Lựa chọn:</w:t>
+      </w:r>
+    </w:p>
+    <w:p>
+      <w:r>
+        <w:t>Port (SSL/TLS):</w:t>
+      </w:r>
+      <w:r>
+        <w:t xml:space="preserve"> </w:t>
+      </w:r>
+      <w:r>
+        <w:t>8883</w:t>
+      </w:r>
+    </w:p>
+    <w:p>
+      <w:r>
+        <w:t>WebSocket URL (WS):</w:t>
+      </w:r>
+      <w:r>
+        <w:t xml:space="preserve"> </w:t>
+      </w:r>
+      <w:r>
+        <w:t>ws://broker.freemqtt.com:8083/mqtt</w:t>
+      </w:r>
+    </w:p>
+    <w:p>
+      <w:r>
+        <w:t>WebSocket URL (WSS):</w:t>
+      </w:r>
+      <w:r>
+        <w:t xml:space="preserve"> </w:t>
+      </w:r>
+      <w:r>
+        <w:t>wss://broker.freemqtt.com:8084/mqtt</w:t>
+      </w:r>
+    </w:p>
+    <w:p>
+      <w:pPr>
+        <w:pStyle w:val="Heading2"/>
+        <w:numPr>
+          <w:ilvl w:val="1"/>
+          <w:numId w:val="2"/>
+        </w:numPr>
+      </w:pPr>
+      <w:bookmarkStart w:id="8" w:name="_Toc228455151"/>
+      <w:r>
+        <w:t>MQTT client with GUI</w:t>
+      </w:r>
+      <w:bookmarkEnd w:id="8"/>
+      <w:r>
+        <w:t xml:space="preserve"> </w:t>
+      </w:r>
+    </w:p>
+    <w:p>
+      <w:r>
+        <w:t>MQTTX</w:t>
+      </w:r>
+      <w:r>
+        <w:t xml:space="preserve"> : </w:t>
+      </w:r>
+      <w:hyperlink r:id="rId11" w:history="1">
+        <w:r>
+          <w:rPr>
+            <w:rStyle w:val="Hyperlink"/>
+          </w:rPr>
+          <w:t>https://mqttx.app/</w:t>
+        </w:r>
+      </w:hyperlink>
+    </w:p>
+    <w:p>
+      <w:r>
+        <w:t>Tạo connection</w:t>
+      </w:r>
+    </w:p>
+    <w:p>
+      <w:r>
+        <w:lastRenderedPageBreak/>
+        <w:t xml:space="preserve">Host: </w:t>
+      </w:r>
+      <w:r>
+        <w:t>mqtt://broker.freemqtt.com</w:t>
+      </w:r>
+    </w:p>
+    <w:p>
+      <w:r>
+        <w:t>Port: 1883</w:t>
+      </w:r>
+    </w:p>
+    <w:p>
+      <w:r>
+        <w:t>Client ID : Duy nhất cho một user</w:t>
+      </w:r>
+    </w:p>
+    <w:p>
+      <w:r>
+        <w:t xml:space="preserve">Username: </w:t>
+      </w:r>
+      <w:r>
+        <w:t>freemqtt</w:t>
+      </w:r>
+    </w:p>
+    <w:p>
+      <w:r>
+        <w:t>Password: public</w:t>
+      </w:r>
+    </w:p>
+    <w:p>
+      <w:r>
+        <w:rPr>
+          <w:noProof/>
+        </w:rPr>
+        <w:drawing>
+          <wp:inline distT="0" distB="0" distL="0" distR="0" wp14:anchorId="521AB2D9" wp14:editId="403E7972">
+            <wp:extent cx="5934075" cy="914400"/>
+            <wp:effectExtent l="0" t="0" r="9525" b="0"/>
+            <wp:docPr id="121059863" name="Picture 1"/>
+            <wp:cNvGraphicFramePr>
+              <a:graphicFrameLocks xmlns:a="http://schemas.openxmlformats.org/drawingml/2006/main" noChangeAspect="1"/>
+            </wp:cNvGraphicFramePr>
+            <a:graphic xmlns:a="http://schemas.openxmlformats.org/drawingml/2006/main">
+              <a:graphicData uri="http://schemas.openxmlformats.org/drawingml/2006/picture">
+                <pic:pic xmlns:pic="http://schemas.openxmlformats.org/drawingml/2006/picture">
+                  <pic:nvPicPr>
+                    <pic:cNvPr id="0" name="Picture 1"/>
+                    <pic:cNvPicPr>
+                      <a:picLocks noChangeAspect="1" noChangeArrowheads="1"/>
+                    </pic:cNvPicPr>
+                  </pic:nvPicPr>
+                  <pic:blipFill>
+                    <a:blip r:embed="rId12" cstate="print">
+                      <a:extLst>
+                        <a:ext uri="{28A0092B-C50C-407E-A947-70E740481C1C}">
+                          <a14:useLocalDpi xmlns:a14="http://schemas.microsoft.com/office/drawing/2010/main" val="0"/>
+                        </a:ext>
+                      </a:extLst>
+                    </a:blip>
+                    <a:srcRect/>
+                    <a:stretch>
+                      <a:fillRect/>
+                    </a:stretch>
+                  </pic:blipFill>
+                  <pic:spPr bwMode="auto">
+                    <a:xfrm>
+                      <a:off x="0" y="0"/>
+                      <a:ext cx="5934075" cy="914400"/>
+                    </a:xfrm>
+                    <a:prstGeom prst="rect">
+                      <a:avLst/>
+                    </a:prstGeom>
+                    <a:noFill/>
+                    <a:ln>
+                      <a:noFill/>
+                    </a:ln>
+                  </pic:spPr>
+                </pic:pic>
+              </a:graphicData>
+            </a:graphic>
+          </wp:inline>
+        </w:drawing>
+      </w:r>
+    </w:p>
+    <w:p>
+      <w:r>
+        <w:t xml:space="preserve">Đăng ký </w:t>
+      </w:r>
+      <w:r>
+        <w:t>Subscription: RTCM/HOME_HN</w:t>
+      </w:r>
+    </w:p>
+    <w:p>
+      <w:r>
+        <w:rPr>
+          <w:noProof/>
+        </w:rPr>
+        <w:drawing>
+          <wp:inline distT="0" distB="0" distL="0" distR="0" wp14:anchorId="4B2EE43F" wp14:editId="138DD0D5">
+            <wp:extent cx="5943600" cy="3343275"/>
+            <wp:effectExtent l="0" t="0" r="0" b="9525"/>
+            <wp:docPr id="112494514" name="Picture 1"/>
+            <wp:cNvGraphicFramePr>
+              <a:graphicFrameLocks xmlns:a="http://schemas.openxmlformats.org/drawingml/2006/main" noChangeAspect="1"/>
+            </wp:cNvGraphicFramePr>
+            <a:graphic xmlns:a="http://schemas.openxmlformats.org/drawingml/2006/main">
+              <a:graphicData uri="http://schemas.openxmlformats.org/drawingml/2006/picture">
+                <pic:pic xmlns:pic="http://schemas.openxmlformats.org/drawingml/2006/picture">
+                  <pic:nvPicPr>
+                    <pic:cNvPr id="112494514" name=""/>
+                    <pic:cNvPicPr/>
+                  </pic:nvPicPr>
+                  <pic:blipFill>
+                    <a:blip r:embed="rId13"/>
+                    <a:stretch>
+                      <a:fillRect/>
+                    </a:stretch>
+                  </pic:blipFill>
+                  <pic:spPr>
+                    <a:xfrm>
+                      <a:off x="0" y="0"/>
+                      <a:ext cx="5943600" cy="3343275"/>
+                    </a:xfrm>
+                    <a:prstGeom prst="rect">
+                      <a:avLst/>
+                    </a:prstGeom>
+                  </pic:spPr>
+                </pic:pic>
+              </a:graphicData>
+            </a:graphic>
+          </wp:inline>
+        </w:drawing>
+      </w:r>
+    </w:p>
+    <w:p>
+      <w:pPr>
+        <w:pStyle w:val="Heading2"/>
+        <w:numPr>
+          <w:ilvl w:val="1"/>
+          <w:numId w:val="2"/>
+        </w:numPr>
+      </w:pPr>
+      <w:bookmarkStart w:id="9" w:name="_Toc228455152"/>
+      <w:r>
+        <w:t xml:space="preserve">Paho </w:t>
+      </w:r>
+      <w:r>
+        <w:t xml:space="preserve">MQTT </w:t>
+      </w:r>
+      <w:r>
+        <w:t>C library – VS2022</w:t>
+      </w:r>
+      <w:bookmarkEnd w:id="9"/>
+    </w:p>
+    <w:p>
+      <w:r>
+        <w:t xml:space="preserve">clone : </w:t>
+      </w:r>
+      <w:hyperlink r:id="rId14" w:history="1">
+        <w:r>
+          <w:rPr>
+            <w:rStyle w:val="Hyperlink"/>
+          </w:rPr>
+          <w:t>https://github.com/eclipse-paho/paho.mqtt.c.git</w:t>
+        </w:r>
+      </w:hyperlink>
+      <w:r>
+        <w:t xml:space="preserve"> vào thư mục </w:t>
+      </w:r>
+      <w:r>
+        <w:t>D:/NeoM8p/paho.mqtt.c</w:t>
+      </w:r>
+    </w:p>
+    <w:p>
+      <w:r>
+        <w:t xml:space="preserve">Tạo thư mục : </w:t>
+      </w:r>
+      <w:r>
+        <w:t>D:/NeoM8p/paho.mqtt.c/build</w:t>
+      </w:r>
+    </w:p>
+    <w:p>
+      <w:r>
+        <w:t>Sử dụng Cmake-GUI tạo project build with VS2022</w:t>
+      </w:r>
+    </w:p>
+    <w:p>
+      <w:r>
+        <w:rPr>
+          <w:noProof/>
+        </w:rPr>
+        <w:lastRenderedPageBreak/>
+        <w:drawing>
+          <wp:inline distT="0" distB="0" distL="0" distR="0" wp14:anchorId="2AE52C5E" wp14:editId="42385331">
+            <wp:extent cx="5943600" cy="3343275"/>
+            <wp:effectExtent l="0" t="0" r="0" b="9525"/>
+            <wp:docPr id="390485733" name="Picture 1"/>
+            <wp:cNvGraphicFramePr>
+              <a:graphicFrameLocks xmlns:a="http://schemas.openxmlformats.org/drawingml/2006/main" noChangeAspect="1"/>
+            </wp:cNvGraphicFramePr>
+            <a:graphic xmlns:a="http://schemas.openxmlformats.org/drawingml/2006/main">
+              <a:graphicData uri="http://schemas.openxmlformats.org/drawingml/2006/picture">
+                <pic:pic xmlns:pic="http://schemas.openxmlformats.org/drawingml/2006/picture">
+                  <pic:nvPicPr>
+                    <pic:cNvPr id="390485733" name=""/>
+                    <pic:cNvPicPr/>
+                  </pic:nvPicPr>
+                  <pic:blipFill>
+                    <a:blip r:embed="rId15"/>
+                    <a:stretch>
+                      <a:fillRect/>
+                    </a:stretch>
+                  </pic:blipFill>
+                  <pic:spPr>
+                    <a:xfrm>
+                      <a:off x="0" y="0"/>
+                      <a:ext cx="5943600" cy="3343275"/>
+                    </a:xfrm>
+                    <a:prstGeom prst="rect">
+                      <a:avLst/>
+                    </a:prstGeom>
+                  </pic:spPr>
+                </pic:pic>
+              </a:graphicData>
+            </a:graphic>
+          </wp:inline>
+        </w:drawing>
+      </w:r>
+    </w:p>
+    <w:p>
+      <w:pPr>
+        <w:pStyle w:val="Heading2"/>
+      </w:pPr>
+      <w:bookmarkStart w:id="10" w:name="_Toc228455153"/>
+      <w:r>
+        <w:t xml:space="preserve">4.4 </w:t>
+      </w:r>
+      <w:r>
+        <w:t>Tạo thư mục install Paho MQTT C</w:t>
+      </w:r>
+      <w:bookmarkEnd w:id="10"/>
+    </w:p>
+    <w:p>
+      <w:pPr>
+        <w:pStyle w:val="ListParagraph"/>
+        <w:ind w:left="840"/>
+      </w:pPr>
+      <w:r>
+        <w:t>D:\NeoM8p\CppNTRIP\PahoMqtt\inc</w:t>
+      </w:r>
+    </w:p>
+    <w:p>
+      <w:pPr>
+        <w:pStyle w:val="ListParagraph"/>
+        <w:ind w:left="840"/>
+      </w:pPr>
+      <w:r>
+        <w:rPr>
+          <w:noProof/>
+        </w:rPr>
+        <w:drawing>
+          <wp:inline distT="0" distB="0" distL="0" distR="0" wp14:anchorId="6B6D57EF" wp14:editId="2B066848">
+            <wp:extent cx="5941060" cy="1934210"/>
+            <wp:effectExtent l="0" t="0" r="2540" b="8890"/>
+            <wp:docPr id="982836055" name="Picture 2"/>
+            <wp:cNvGraphicFramePr>
+              <a:graphicFrameLocks xmlns:a="http://schemas.openxmlformats.org/drawingml/2006/main" noChangeAspect="1"/>
+            </wp:cNvGraphicFramePr>
+            <a:graphic xmlns:a="http://schemas.openxmlformats.org/drawingml/2006/main">
+              <a:graphicData uri="http://schemas.openxmlformats.org/drawingml/2006/picture">
+                <pic:pic xmlns:pic="http://schemas.openxmlformats.org/drawingml/2006/picture">
+                  <pic:nvPicPr>
+                    <pic:cNvPr id="0" name="Picture 2"/>
+                    <pic:cNvPicPr>
+                      <a:picLocks noChangeAspect="1" noChangeArrowheads="1"/>
+                    </pic:cNvPicPr>
+                  </pic:nvPicPr>
+                  <pic:blipFill>
+                    <a:blip r:embed="rId16">
+                      <a:extLst>
+                        <a:ext uri="{28A0092B-C50C-407E-A947-70E740481C1C}">
+                          <a14:useLocalDpi xmlns:a14="http://schemas.microsoft.com/office/drawing/2010/main" val="0"/>
+                        </a:ext>
+                      </a:extLst>
+                    </a:blip>
+                    <a:srcRect/>
+                    <a:stretch>
+                      <a:fillRect/>
+                    </a:stretch>
+                  </pic:blipFill>
+                  <pic:spPr bwMode="auto">
+                    <a:xfrm>
+                      <a:off x="0" y="0"/>
+                      <a:ext cx="5941060" cy="1934210"/>
+                    </a:xfrm>
+                    <a:prstGeom prst="rect">
+                      <a:avLst/>
+                    </a:prstGeom>
+                    <a:noFill/>
+                    <a:ln>
+                      <a:noFill/>
+                    </a:ln>
+                  </pic:spPr>
+                </pic:pic>
+              </a:graphicData>
+            </a:graphic>
+          </wp:inline>
+        </w:drawing>
+      </w:r>
+    </w:p>
+    <w:p>
+      <w:pPr>
+        <w:pStyle w:val="ListParagraph"/>
+        <w:ind w:left="840"/>
+      </w:pPr>
+      <w:r>
+        <w:t>D:\NeoM8p\CppNTRIP\PahoMqtt\</w:t>
+      </w:r>
+      <w:r>
+        <w:t>lib</w:t>
+      </w:r>
+    </w:p>
+    <w:p>
+      <w:pPr>
+        <w:pStyle w:val="ListParagraph"/>
+        <w:ind w:left="840"/>
+      </w:pPr>
+      <w:r>
+        <w:rPr>
+          <w:noProof/>
+        </w:rPr>
+        <w:drawing>
+          <wp:inline distT="0" distB="0" distL="0" distR="0" wp14:anchorId="2FDAA2DE" wp14:editId="628AF993">
+            <wp:extent cx="5941060" cy="1109980"/>
+            <wp:effectExtent l="0" t="0" r="2540" b="0"/>
+            <wp:docPr id="1335973985" name="Picture 3"/>
+            <wp:cNvGraphicFramePr>
+              <a:graphicFrameLocks xmlns:a="http://schemas.openxmlformats.org/drawingml/2006/main" noChangeAspect="1"/>
+            </wp:cNvGraphicFramePr>
+            <a:graphic xmlns:a="http://schemas.openxmlformats.org/drawingml/2006/main">
+              <a:graphicData uri="http://schemas.openxmlformats.org/drawingml/2006/picture">
+                <pic:pic xmlns:pic="http://schemas.openxmlformats.org/drawingml/2006/picture">
+                  <pic:nvPicPr>
+                    <pic:cNvPr id="0" name="Picture 3"/>
+                    <pic:cNvPicPr>
+                      <a:picLocks noChangeAspect="1" noChangeArrowheads="1"/>
+                    </pic:cNvPicPr>
+                  </pic:nvPicPr>
+                  <pic:blipFill>
+                    <a:blip r:embed="rId17">
+                      <a:extLst>
+                        <a:ext uri="{28A0092B-C50C-407E-A947-70E740481C1C}">
+                          <a14:useLocalDpi xmlns:a14="http://schemas.microsoft.com/office/drawing/2010/main" val="0"/>
+                        </a:ext>
+                      </a:extLst>
+                    </a:blip>
+                    <a:srcRect/>
+                    <a:stretch>
+                      <a:fillRect/>
+                    </a:stretch>
+                  </pic:blipFill>
+                  <pic:spPr bwMode="auto">
+                    <a:xfrm>
+                      <a:off x="0" y="0"/>
+                      <a:ext cx="5941060" cy="1109980"/>
+                    </a:xfrm>
+                    <a:prstGeom prst="rect">
+                      <a:avLst/>
+                    </a:prstGeom>
+                    <a:noFill/>
+                    <a:ln>
+                      <a:noFill/>
+                    </a:ln>
+                  </pic:spPr>
+                </pic:pic>
+              </a:graphicData>
+            </a:graphic>
+          </wp:inline>
+        </w:drawing>
+      </w:r>
+    </w:p>
+    <w:p>
+      <w:pPr>
+        <w:pStyle w:val="ListParagraph"/>
+        <w:ind w:left="840"/>
+      </w:pPr>
+      <w:r>
+        <w:t xml:space="preserve">Copy các thư viện tương ứng với mode dịch từ </w:t>
+      </w:r>
+      <w:r>
+        <w:t>D:\NeoM8p\paho.mqtt.c\build\src\Debug</w:t>
+      </w:r>
+      <w:r>
+        <w:t xml:space="preserve"> </w:t>
+      </w:r>
+    </w:p>
+    <w:p>
+      <w:pPr>
+        <w:pStyle w:val="ListParagraph"/>
+        <w:ind w:left="840"/>
+      </w:pPr>
+      <w:r>
+        <w:rPr>
+          <w:noProof/>
+        </w:rPr>
+        <w:lastRenderedPageBreak/>
+        <w:drawing>
+          <wp:inline distT="0" distB="0" distL="0" distR="0" wp14:anchorId="3EC287EB" wp14:editId="5C056463">
+            <wp:extent cx="5941060" cy="2188210"/>
+            <wp:effectExtent l="0" t="0" r="2540" b="2540"/>
+            <wp:docPr id="924666360" name="Picture 4"/>
+            <wp:cNvGraphicFramePr>
+              <a:graphicFrameLocks xmlns:a="http://schemas.openxmlformats.org/drawingml/2006/main" noChangeAspect="1"/>
+            </wp:cNvGraphicFramePr>
+            <a:graphic xmlns:a="http://schemas.openxmlformats.org/drawingml/2006/main">
+              <a:graphicData uri="http://schemas.openxmlformats.org/drawingml/2006/picture">
+                <pic:pic xmlns:pic="http://schemas.openxmlformats.org/drawingml/2006/picture">
+                  <pic:nvPicPr>
+                    <pic:cNvPr id="0" name="Picture 4"/>
+                    <pic:cNvPicPr>
+                      <a:picLocks noChangeAspect="1" noChangeArrowheads="1"/>
+                    </pic:cNvPicPr>
+                  </pic:nvPicPr>
+                  <pic:blipFill>
+                    <a:blip r:embed="rId18">
+                      <a:extLst>
+                        <a:ext uri="{28A0092B-C50C-407E-A947-70E740481C1C}">
+                          <a14:useLocalDpi xmlns:a14="http://schemas.microsoft.com/office/drawing/2010/main" val="0"/>
+                        </a:ext>
+                      </a:extLst>
+                    </a:blip>
+                    <a:srcRect/>
+                    <a:stretch>
+                      <a:fillRect/>
+                    </a:stretch>
+                  </pic:blipFill>
+                  <pic:spPr bwMode="auto">
+                    <a:xfrm>
+                      <a:off x="0" y="0"/>
+                      <a:ext cx="5941060" cy="2188210"/>
+                    </a:xfrm>
+                    <a:prstGeom prst="rect">
+                      <a:avLst/>
+                    </a:prstGeom>
+                    <a:noFill/>
+                    <a:ln>
+                      <a:noFill/>
+                    </a:ln>
+                  </pic:spPr>
+                </pic:pic>
+              </a:graphicData>
+            </a:graphic>
+          </wp:inline>
+        </w:drawing>
+      </w:r>
+    </w:p>
+    <w:p>
+      <w:pPr>
+        <w:pStyle w:val="ListParagraph"/>
+        <w:ind w:left="840"/>
+      </w:pPr>
+      <w:r>
+        <w:t>Cấu hình project in VS2022</w:t>
+      </w:r>
+    </w:p>
+    <w:p>
+      <w:pPr>
+        <w:pStyle w:val="ListParagraph"/>
+        <w:ind w:left="840"/>
+      </w:pPr>
+      <w:r>
+        <w:t xml:space="preserve">Include </w:t>
+      </w:r>
+      <w:r>
+        <w:t>Directorie</w:t>
+      </w:r>
+      <w:r>
+        <w:t xml:space="preserve">s cho </w:t>
+      </w:r>
+      <w:r>
+        <w:rPr>
+          <w:color w:val="EE0000"/>
+        </w:rPr>
+        <w:t>tất cả các mode</w:t>
+      </w:r>
+      <w:r>
+        <w:t xml:space="preserve"> dịch:</w:t>
+      </w:r>
+    </w:p>
+    <w:p>
+      <w:pPr>
+        <w:pStyle w:val="ListParagraph"/>
+        <w:ind w:left="840"/>
+      </w:pPr>
+      <w:r>
+        <w:rPr>
+          <w:noProof/>
+        </w:rPr>
+        <w:drawing>
+          <wp:inline distT="0" distB="0" distL="0" distR="0" wp14:anchorId="51559F8F" wp14:editId="1EDB6144">
+            <wp:extent cx="5941060" cy="2051050"/>
+            <wp:effectExtent l="0" t="0" r="2540" b="6350"/>
+            <wp:docPr id="1959124565" name="Picture 5"/>
+            <wp:cNvGraphicFramePr>
+              <a:graphicFrameLocks xmlns:a="http://schemas.openxmlformats.org/drawingml/2006/main" noChangeAspect="1"/>
+            </wp:cNvGraphicFramePr>
+            <a:graphic xmlns:a="http://schemas.openxmlformats.org/drawingml/2006/main">
+              <a:graphicData uri="http://schemas.openxmlformats.org/drawingml/2006/picture">
+                <pic:pic xmlns:pic="http://schemas.openxmlformats.org/drawingml/2006/picture">
+                  <pic:nvPicPr>
+                    <pic:cNvPr id="0" name="Picture 5"/>
+                    <pic:cNvPicPr>
+                      <a:picLocks noChangeAspect="1" noChangeArrowheads="1"/>
+                    </pic:cNvPicPr>
+                  </pic:nvPicPr>
+                  <pic:blipFill>
+                    <a:blip r:embed="rId19">
+                      <a:extLst>
+                        <a:ext uri="{28A0092B-C50C-407E-A947-70E740481C1C}">
+                          <a14:useLocalDpi xmlns:a14="http://schemas.microsoft.com/office/drawing/2010/main" val="0"/>
+                        </a:ext>
+                      </a:extLst>
+                    </a:blip>
+                    <a:srcRect/>
+                    <a:stretch>
+                      <a:fillRect/>
+                    </a:stretch>
+                  </pic:blipFill>
+                  <pic:spPr bwMode="auto">
+                    <a:xfrm>
+                      <a:off x="0" y="0"/>
+                      <a:ext cx="5941060" cy="2051050"/>
+                    </a:xfrm>
+                    <a:prstGeom prst="rect">
+                      <a:avLst/>
+                    </a:prstGeom>
+                    <a:noFill/>
+                    <a:ln>
+                      <a:noFill/>
+                    </a:ln>
+                  </pic:spPr>
+                </pic:pic>
+              </a:graphicData>
+            </a:graphic>
+          </wp:inline>
+        </w:drawing>
+      </w:r>
+    </w:p>
+    <w:p>
+      <w:pPr>
+        <w:pStyle w:val="ListParagraph"/>
+        <w:ind w:left="840"/>
+      </w:pPr>
+      <w:r>
+        <w:t>Library</w:t>
+      </w:r>
+      <w:r>
+        <w:t xml:space="preserve"> Directories cho </w:t>
+      </w:r>
+      <w:r>
+        <w:rPr>
+          <w:color w:val="EE0000"/>
+        </w:rPr>
+        <w:t>t</w:t>
+      </w:r>
+      <w:r>
+        <w:rPr>
+          <w:color w:val="EE0000"/>
+        </w:rPr>
+        <w:t>ừng mode</w:t>
+      </w:r>
+      <w:r>
+        <w:t xml:space="preserve"> </w:t>
+      </w:r>
+      <w:r>
+        <w:t>:</w:t>
+      </w:r>
+    </w:p>
+    <w:p>
+      <w:pPr>
+        <w:pStyle w:val="ListParagraph"/>
+        <w:ind w:left="840"/>
+      </w:pPr>
+      <w:r>
+        <w:rPr>
+          <w:noProof/>
+        </w:rPr>
+        <w:drawing>
+          <wp:inline distT="0" distB="0" distL="0" distR="0" wp14:anchorId="5DBB32A8" wp14:editId="56158C3C">
+            <wp:extent cx="5941060" cy="2357120"/>
+            <wp:effectExtent l="0" t="0" r="2540" b="5080"/>
+            <wp:docPr id="1610526449" name="Picture 6"/>
+            <wp:cNvGraphicFramePr>
+              <a:graphicFrameLocks xmlns:a="http://schemas.openxmlformats.org/drawingml/2006/main" noChangeAspect="1"/>
+            </wp:cNvGraphicFramePr>
+            <a:graphic xmlns:a="http://schemas.openxmlformats.org/drawingml/2006/main">
+              <a:graphicData uri="http://schemas.openxmlformats.org/drawingml/2006/picture">
+                <pic:pic xmlns:pic="http://schemas.openxmlformats.org/drawingml/2006/picture">
+                  <pic:nvPicPr>
+                    <pic:cNvPr id="0" name="Picture 6"/>
+                    <pic:cNvPicPr>
+                      <a:picLocks noChangeAspect="1" noChangeArrowheads="1"/>
+                    </pic:cNvPicPr>
+                  </pic:nvPicPr>
+                  <pic:blipFill>
+                    <a:blip r:embed="rId20">
+                      <a:extLst>
+                        <a:ext uri="{28A0092B-C50C-407E-A947-70E740481C1C}">
+                          <a14:useLocalDpi xmlns:a14="http://schemas.microsoft.com/office/drawing/2010/main" val="0"/>
+                        </a:ext>
+                      </a:extLst>
+                    </a:blip>
+                    <a:srcRect/>
+                    <a:stretch>
+                      <a:fillRect/>
+                    </a:stretch>
+                  </pic:blipFill>
+                  <pic:spPr bwMode="auto">
+                    <a:xfrm>
+                      <a:off x="0" y="0"/>
+                      <a:ext cx="5941060" cy="2357120"/>
+                    </a:xfrm>
+                    <a:prstGeom prst="rect">
+                      <a:avLst/>
+                    </a:prstGeom>
+                    <a:noFill/>
+                    <a:ln>
+                      <a:noFill/>
+                    </a:ln>
+                  </pic:spPr>
+                </pic:pic>
+              </a:graphicData>
+            </a:graphic>
+          </wp:inline>
+        </w:drawing>
+      </w:r>
+    </w:p>
+    <w:p>
+      <w:pPr>
+        <w:pStyle w:val="ListParagraph"/>
+        <w:ind w:left="840"/>
+      </w:pPr>
+      <w:r>
+        <w:t>Linker\Input cho tất cả các mode dịch:</w:t>
+      </w:r>
+    </w:p>
+    <w:p>
+      <w:pPr>
+        <w:pStyle w:val="ListParagraph"/>
+        <w:ind w:left="840"/>
+      </w:pPr>
+      <w:r>
+        <w:rPr>
+          <w:noProof/>
+        </w:rPr>
+        <w:lastRenderedPageBreak/>
+        <w:drawing>
+          <wp:inline distT="0" distB="0" distL="0" distR="0" wp14:anchorId="36B556E2" wp14:editId="48D7F647">
+            <wp:extent cx="5941060" cy="2119630"/>
+            <wp:effectExtent l="0" t="0" r="2540" b="0"/>
+            <wp:docPr id="1019828964" name="Picture 7"/>
+            <wp:cNvGraphicFramePr>
+              <a:graphicFrameLocks xmlns:a="http://schemas.openxmlformats.org/drawingml/2006/main" noChangeAspect="1"/>
+            </wp:cNvGraphicFramePr>
+            <a:graphic xmlns:a="http://schemas.openxmlformats.org/drawingml/2006/main">
+              <a:graphicData uri="http://schemas.openxmlformats.org/drawingml/2006/picture">
+                <pic:pic xmlns:pic="http://schemas.openxmlformats.org/drawingml/2006/picture">
+                  <pic:nvPicPr>
+                    <pic:cNvPr id="0" name="Picture 7"/>
+                    <pic:cNvPicPr>
+                      <a:picLocks noChangeAspect="1" noChangeArrowheads="1"/>
+                    </pic:cNvPicPr>
+                  </pic:nvPicPr>
+                  <pic:blipFill>
+                    <a:blip r:embed="rId21">
+                      <a:extLst>
+                        <a:ext uri="{28A0092B-C50C-407E-A947-70E740481C1C}">
+                          <a14:useLocalDpi xmlns:a14="http://schemas.microsoft.com/office/drawing/2010/main" val="0"/>
+                        </a:ext>
+                      </a:extLst>
+                    </a:blip>
+                    <a:srcRect/>
+                    <a:stretch>
+                      <a:fillRect/>
+                    </a:stretch>
+                  </pic:blipFill>
+                  <pic:spPr bwMode="auto">
+                    <a:xfrm>
+                      <a:off x="0" y="0"/>
+                      <a:ext cx="5941060" cy="2119630"/>
+                    </a:xfrm>
+                    <a:prstGeom prst="rect">
+                      <a:avLst/>
+                    </a:prstGeom>
+                    <a:noFill/>
+                    <a:ln>
+                      <a:noFill/>
+                    </a:ln>
+                  </pic:spPr>
+                </pic:pic>
+              </a:graphicData>
+            </a:graphic>
+          </wp:inline>
+        </w:drawing>
+      </w:r>
+    </w:p>
+    <w:p>
+      <w:pPr>
+        <w:pStyle w:val="Heading2"/>
+      </w:pPr>
+      <w:bookmarkStart w:id="11" w:name="_Toc228455154"/>
+      <w:r>
+        <w:t>4.5 Paho MQTT với các ngôn ngữ lập trình khác</w:t>
+      </w:r>
+      <w:bookmarkEnd w:id="11"/>
+    </w:p>
+    <w:p>
+      <w:pPr>
+        <w:pStyle w:val="ListParagraph"/>
+        <w:ind w:left="840"/>
+      </w:pPr>
+      <w:r>
+        <w:t xml:space="preserve">Link: </w:t>
+      </w:r>
+      <w:hyperlink r:id="rId22" w:history="1">
+        <w:r>
+          <w:rPr>
+            <w:rStyle w:val="Hyperlink"/>
+          </w:rPr>
+          <w:t>Eclipse Paho</w:t>
+        </w:r>
+      </w:hyperlink>
+    </w:p>
     <w:sectPr>
       <w:pgSz w:w="12240" w:h="15840"/>
       <w:pgMar w:top="1440" w:right="1440" w:bottom="1440" w:left="1440" w:header="720" w:footer="720" w:gutter="0"/>
@@ -1102,6 +2480,127 @@
 <file path=word/numbering.xml><?xml version="1.0" encoding="utf-8"?>
 <w:numbering xmlns:wpc="http://schemas.microsoft.com/office/word/2010/wordprocessingCanvas" xmlns:cx="http://schemas.microsoft.com/office/drawing/2014/chartex" xmlns:cx1="http://schemas.microsoft.com/office/drawing/2015/9/8/chartex" xmlns:cx2="http://schemas.microsoft.com/office/drawing/2015/10/21/chartex" xmlns:cx3="http://schemas.microsoft.com/office/drawing/2016/5/9/chartex" xmlns:cx4="http://schemas.microsoft.com/office/drawing/2016/5/10/chartex" xmlns:cx5="http://schemas.microsoft.com/office/drawing/2016/5/11/chartex" xmlns:cx6="http://schemas.microsoft.com/office/drawing/2016/5/12/chartex" xmlns:cx7="http://schemas.microsoft.com/office/drawing/2016/5/13/chartex" xmlns:cx8="http://schemas.microsoft.com/office/drawing/2016/5/14/chartex" xmlns:mc="http://schemas.openxmlformats.org/markup-compatibility/2006" xmlns:aink="http://schemas.microsoft.com/office/drawing/2016/ink" xmlns:am3d="http://schemas.microsoft.com/office/drawing/2017/model3d" xmlns:o="urn:schemas-microsoft-com:office:office" xmlns:oel="http://schemas.microsoft.com/office/2019/extlst" xmlns:r="http://schemas.openxmlformats.org/officeDocument/2006/relationships" xmlns:m="http://schemas.openxmlformats.org/officeDocument/2006/math" xmlns:v="urn:schemas-microsoft-com:vml" xmlns:wp14="http://schemas.microsoft.com/office/word/2010/wordprocessingDrawing" xmlns:wp="http://schemas.openxmlformats.org/drawingml/2006/wordprocessingDrawing" xmlns:w10="urn:schemas-microsoft-com:office:word" xmlns:w="http://schemas.openxmlformats.org/wordprocessingml/2006/main" xmlns:w14="http://schemas.microsoft.com/office/word/2010/wordml" xmlns:w15="http://schemas.microsoft.com/office/word/2012/wordml" xmlns:w16cex="http://schemas.microsoft.com/office/word/2018/wordml/cex" xmlns:w16cid="http://schemas.microsoft.com/office/word/2016/wordml/cid" xmlns:w16="http://schemas.microsoft.com/office/word/2018/wordml" xmlns:w16du="http://schemas.microsoft.com/office/word/2023/wordml/word16du" xmlns:w16sdtdh="http://schemas.microsoft.com/office/word/2020/wordml/sdtdatahash" xmlns:w16sdtfl="http://schemas.microsoft.com/office/word/2024/wordml/sdtformatlock" xmlns:w16se="http://schemas.microsoft.com/office/word/2015/wordml/symex" xmlns:wpg="http://schemas.microsoft.com/office/word/2010/wordprocessingGroup" xmlns:wpi="http://schemas.microsoft.com/office/word/2010/wordprocessingInk" xmlns:wne="http://schemas.microsoft.com/office/word/2006/wordml" xmlns:wps="http://schemas.microsoft.com/office/word/2010/wordprocessingShape" mc:Ignorable="w14 w15 w16se w16cid w16 w16cex w16sdtdh w16sdtfl w16du wp14">
   <w:abstractNum w:abstractNumId="0" w15:restartNumberingAfterBreak="0">
+    <w:nsid w:val="10681F7F"/>
+    <w:multiLevelType w:val="multilevel"/>
+    <w:tmpl w:val="F75C4FB8"/>
+    <w:lvl w:ilvl="0">
+      <w:start w:val="1"/>
+      <w:numFmt w:val="decimal"/>
+      <w:lvlText w:val="%1."/>
+      <w:lvlJc w:val="left"/>
+      <w:pPr>
+        <w:ind w:left="720" w:hanging="360"/>
+      </w:pPr>
+      <w:rPr>
+        <w:rFonts w:hint="default"/>
+      </w:rPr>
+    </w:lvl>
+    <w:lvl w:ilvl="1">
+      <w:start w:val="2"/>
+      <w:numFmt w:val="decimal"/>
+      <w:isLgl/>
+      <w:lvlText w:val="%1.%2"/>
+      <w:lvlJc w:val="left"/>
+      <w:pPr>
+        <w:ind w:left="840" w:hanging="480"/>
+      </w:pPr>
+      <w:rPr>
+        <w:rFonts w:hint="default"/>
+      </w:rPr>
+    </w:lvl>
+    <w:lvl w:ilvl="2">
+      <w:start w:val="1"/>
+      <w:numFmt w:val="decimal"/>
+      <w:isLgl/>
+      <w:lvlText w:val="%1.%2.%3"/>
+      <w:lvlJc w:val="left"/>
+      <w:pPr>
+        <w:ind w:left="1080" w:hanging="720"/>
+      </w:pPr>
+      <w:rPr>
+        <w:rFonts w:hint="default"/>
+      </w:rPr>
+    </w:lvl>
+    <w:lvl w:ilvl="3">
+      <w:start w:val="1"/>
+      <w:numFmt w:val="decimal"/>
+      <w:isLgl/>
+      <w:lvlText w:val="%1.%2.%3.%4"/>
+      <w:lvlJc w:val="left"/>
+      <w:pPr>
+        <w:ind w:left="1080" w:hanging="720"/>
+      </w:pPr>
+      <w:rPr>
+        <w:rFonts w:hint="default"/>
+      </w:rPr>
+    </w:lvl>
+    <w:lvl w:ilvl="4">
+      <w:start w:val="1"/>
+      <w:numFmt w:val="decimal"/>
+      <w:isLgl/>
+      <w:lvlText w:val="%1.%2.%3.%4.%5"/>
+      <w:lvlJc w:val="left"/>
+      <w:pPr>
+        <w:ind w:left="1440" w:hanging="1080"/>
+      </w:pPr>
+      <w:rPr>
+        <w:rFonts w:hint="default"/>
+      </w:rPr>
+    </w:lvl>
+    <w:lvl w:ilvl="5">
+      <w:start w:val="1"/>
+      <w:numFmt w:val="decimal"/>
+      <w:isLgl/>
+      <w:lvlText w:val="%1.%2.%3.%4.%5.%6"/>
+      <w:lvlJc w:val="left"/>
+      <w:pPr>
+        <w:ind w:left="1440" w:hanging="1080"/>
+      </w:pPr>
+      <w:rPr>
+        <w:rFonts w:hint="default"/>
+      </w:rPr>
+    </w:lvl>
+    <w:lvl w:ilvl="6">
+      <w:start w:val="1"/>
+      <w:numFmt w:val="decimal"/>
+      <w:isLgl/>
+      <w:lvlText w:val="%1.%2.%3.%4.%5.%6.%7"/>
+      <w:lvlJc w:val="left"/>
+      <w:pPr>
+        <w:ind w:left="1800" w:hanging="1440"/>
+      </w:pPr>
+      <w:rPr>
+        <w:rFonts w:hint="default"/>
+      </w:rPr>
+    </w:lvl>
+    <w:lvl w:ilvl="7">
+      <w:start w:val="1"/>
+      <w:numFmt w:val="decimal"/>
+      <w:isLgl/>
+      <w:lvlText w:val="%1.%2.%3.%4.%5.%6.%7.%8"/>
+      <w:lvlJc w:val="left"/>
+      <w:pPr>
+        <w:ind w:left="1800" w:hanging="1440"/>
+      </w:pPr>
+      <w:rPr>
+        <w:rFonts w:hint="default"/>
+      </w:rPr>
+    </w:lvl>
+    <w:lvl w:ilvl="8">
+      <w:start w:val="1"/>
+      <w:numFmt w:val="decimal"/>
+      <w:isLgl/>
+      <w:lvlText w:val="%1.%2.%3.%4.%5.%6.%7.%8.%9"/>
+      <w:lvlJc w:val="left"/>
+      <w:pPr>
+        <w:ind w:left="2160" w:hanging="1800"/>
+      </w:pPr>
+      <w:rPr>
+        <w:rFonts w:hint="default"/>
+      </w:rPr>
+    </w:lvl>
+  </w:abstractNum>
+  <w:abstractNum w:abstractNumId="1" w15:restartNumberingAfterBreak="0">
     <w:nsid w:val="14AB2623"/>
     <w:multiLevelType w:val="hybridMultilevel"/>
     <w:tmpl w:val="76B6A8C4"/>
@@ -1213,11 +2712,11 @@
       </w:rPr>
     </w:lvl>
   </w:abstractNum>
-  <w:abstractNum w:abstractNumId="1" w15:restartNumberingAfterBreak="0">
+  <w:abstractNum w:abstractNumId="2" w15:restartNumberingAfterBreak="0">
     <w:nsid w:val="5FBA37E8"/>
-    <w:multiLevelType w:val="hybridMultilevel"/>
-    <w:tmpl w:val="1F00833A"/>
-    <w:lvl w:ilvl="0" w:tplc="0409000F">
+    <w:multiLevelType w:val="multilevel"/>
+    <w:tmpl w:val="F75C4FB8"/>
+    <w:lvl w:ilvl="0">
       <w:start w:val="1"/>
       <w:numFmt w:val="decimal"/>
       <w:lvlText w:val="%1."/>
@@ -1229,84 +2728,119 @@
         <w:rFonts w:hint="default"/>
       </w:rPr>
     </w:lvl>
-    <w:lvl w:ilvl="1" w:tplc="04090019" w:tentative="1">
-      <w:start w:val="1"/>
-      <w:numFmt w:val="lowerLetter"/>
-      <w:lvlText w:val="%2."/>
+    <w:lvl w:ilvl="1">
+      <w:start w:val="2"/>
+      <w:numFmt w:val="decimal"/>
+      <w:isLgl/>
+      <w:lvlText w:val="%1.%2"/>
       <w:lvlJc w:val="left"/>
       <w:pPr>
-        <w:ind w:left="1440" w:hanging="360"/>
-      </w:pPr>
+        <w:ind w:left="840" w:hanging="480"/>
+      </w:pPr>
+      <w:rPr>
+        <w:rFonts w:hint="default"/>
+      </w:rPr>
     </w:lvl>
-    <w:lvl w:ilvl="2" w:tplc="0409001B" w:tentative="1">
-      <w:start w:val="1"/>
-      <w:numFmt w:val="lowerRoman"/>
-      <w:lvlText w:val="%3."/>
-      <w:lvlJc w:val="right"/>
-      <w:pPr>
-        <w:ind w:left="2160" w:hanging="180"/>
-      </w:pPr>
-    </w:lvl>
-    <w:lvl w:ilvl="3" w:tplc="0409000F" w:tentative="1">
+    <w:lvl w:ilvl="2">
       <w:start w:val="1"/>
       <w:numFmt w:val="decimal"/>
-      <w:lvlText w:val="%4."/>
+      <w:isLgl/>
+      <w:lvlText w:val="%1.%2.%3"/>
       <w:lvlJc w:val="left"/>
       <w:pPr>
-        <w:ind w:left="2880" w:hanging="360"/>
-      </w:pPr>
+        <w:ind w:left="1080" w:hanging="720"/>
+      </w:pPr>
+      <w:rPr>
+        <w:rFonts w:hint="default"/>
+      </w:rPr>
     </w:lvl>
-    <w:lvl w:ilvl="4" w:tplc="04090019" w:tentative="1">
-      <w:start w:val="1"/>
-      <w:numFmt w:val="lowerLetter"/>
-      <w:lvlText w:val="%5."/>
-      <w:lvlJc w:val="left"/>
-      <w:pPr>
-        <w:ind w:left="3600" w:hanging="360"/>
-      </w:pPr>
-    </w:lvl>
-    <w:lvl w:ilvl="5" w:tplc="0409001B" w:tentative="1">
-      <w:start w:val="1"/>
-      <w:numFmt w:val="lowerRoman"/>
-      <w:lvlText w:val="%6."/>
-      <w:lvlJc w:val="right"/>
-      <w:pPr>
-        <w:ind w:left="4320" w:hanging="180"/>
-      </w:pPr>
-    </w:lvl>
-    <w:lvl w:ilvl="6" w:tplc="0409000F" w:tentative="1">
+    <w:lvl w:ilvl="3">
       <w:start w:val="1"/>
       <w:numFmt w:val="decimal"/>
-      <w:lvlText w:val="%7."/>
+      <w:isLgl/>
+      <w:lvlText w:val="%1.%2.%3.%4"/>
       <w:lvlJc w:val="left"/>
       <w:pPr>
-        <w:ind w:left="5040" w:hanging="360"/>
-      </w:pPr>
+        <w:ind w:left="1080" w:hanging="720"/>
+      </w:pPr>
+      <w:rPr>
+        <w:rFonts w:hint="default"/>
+      </w:rPr>
     </w:lvl>
-    <w:lvl w:ilvl="7" w:tplc="04090019" w:tentative="1">
+    <w:lvl w:ilvl="4">
       <w:start w:val="1"/>
-      <w:numFmt w:val="lowerLetter"/>
-      <w:lvlText w:val="%8."/>
+      <w:numFmt w:val="decimal"/>
+      <w:isLgl/>
+      <w:lvlText w:val="%1.%2.%3.%4.%5"/>
       <w:lvlJc w:val="left"/>
       <w:pPr>
-        <w:ind w:left="5760" w:hanging="360"/>
-      </w:pPr>
+        <w:ind w:left="1440" w:hanging="1080"/>
+      </w:pPr>
+      <w:rPr>
+        <w:rFonts w:hint="default"/>
+      </w:rPr>
     </w:lvl>
-    <w:lvl w:ilvl="8" w:tplc="0409001B" w:tentative="1">
+    <w:lvl w:ilvl="5">
       <w:start w:val="1"/>
-      <w:numFmt w:val="lowerRoman"/>
-      <w:lvlText w:val="%9."/>
-      <w:lvlJc w:val="right"/>
-      <w:pPr>
-        <w:ind w:left="6480" w:hanging="180"/>
-      </w:pPr>
+      <w:numFmt w:val="decimal"/>
+      <w:isLgl/>
+      <w:lvlText w:val="%1.%2.%3.%4.%5.%6"/>
+      <w:lvlJc w:val="left"/>
+      <w:pPr>
+        <w:ind w:left="1440" w:hanging="1080"/>
+      </w:pPr>
+      <w:rPr>
+        <w:rFonts w:hint="default"/>
+      </w:rPr>
+    </w:lvl>
+    <w:lvl w:ilvl="6">
+      <w:start w:val="1"/>
+      <w:numFmt w:val="decimal"/>
+      <w:isLgl/>
+      <w:lvlText w:val="%1.%2.%3.%4.%5.%6.%7"/>
+      <w:lvlJc w:val="left"/>
+      <w:pPr>
+        <w:ind w:left="1800" w:hanging="1440"/>
+      </w:pPr>
+      <w:rPr>
+        <w:rFonts w:hint="default"/>
+      </w:rPr>
+    </w:lvl>
+    <w:lvl w:ilvl="7">
+      <w:start w:val="1"/>
+      <w:numFmt w:val="decimal"/>
+      <w:isLgl/>
+      <w:lvlText w:val="%1.%2.%3.%4.%5.%6.%7.%8"/>
+      <w:lvlJc w:val="left"/>
+      <w:pPr>
+        <w:ind w:left="1800" w:hanging="1440"/>
+      </w:pPr>
+      <w:rPr>
+        <w:rFonts w:hint="default"/>
+      </w:rPr>
+    </w:lvl>
+    <w:lvl w:ilvl="8">
+      <w:start w:val="1"/>
+      <w:numFmt w:val="decimal"/>
+      <w:isLgl/>
+      <w:lvlText w:val="%1.%2.%3.%4.%5.%6.%7.%8.%9"/>
+      <w:lvlJc w:val="left"/>
+      <w:pPr>
+        <w:ind w:left="2160" w:hanging="1800"/>
+      </w:pPr>
+      <w:rPr>
+        <w:rFonts w:hint="default"/>
+      </w:rPr>
     </w:lvl>
   </w:abstractNum>
   <w:num w:numId="1" w16cid:durableId="1401488245">
-    <w:abstractNumId w:val="0"/>
+    <w:abstractNumId w:val="1"/>
   </w:num>
   <w:num w:numId="2" w16cid:durableId="1651641621">
-    <w:abstractNumId w:val="1"/>
+    <w:abstractNumId w:val="2"/>
+  </w:num>
+  <w:num w:numId="3" w16cid:durableId="1938709603">
+    <w:abstractNumId w:val="0"/>
   </w:num>
 </w:numbering>
 </file>
@@ -1739,7 +3273,6 @@
     <w:next w:val="Normal"/>
     <w:link w:val="Heading2Char"/>
     <w:uiPriority w:val="9"/>
-    <w:semiHidden/>
     <w:unhideWhenUsed/>
     <w:qFormat/>
     <w:rsid w:val="007159FC"/>
@@ -1914,7 +3447,6 @@
   <w:style w:type="character" w:default="1" w:styleId="DefaultParagraphFont">
     <w:name w:val="Default Paragraph Font"/>
     <w:uiPriority w:val="1"/>
-    <w:semiHidden/>
     <w:unhideWhenUsed/>
   </w:style>
   <w:style w:type="table" w:default="1" w:styleId="TableNormal">
@@ -1956,7 +3488,6 @@
     <w:basedOn w:val="DefaultParagraphFont"/>
     <w:link w:val="Heading2"/>
     <w:uiPriority w:val="9"/>
-    <w:semiHidden/>
     <w:rsid w:val="007159FC"/>
     <w:rPr>
       <w:rFonts w:asciiTheme="majorHAnsi" w:eastAsiaTheme="majorEastAsia" w:hAnsiTheme="majorHAnsi" w:cstheme="majorBidi"/>
@@ -2289,6 +3820,31 @@
       <w:u w:val="single"/>
     </w:rPr>
   </w:style>
+  <w:style w:type="character" w:styleId="UnresolvedMention">
+    <w:name w:val="Unresolved Mention"/>
+    <w:basedOn w:val="DefaultParagraphFont"/>
+    <w:uiPriority w:val="99"/>
+    <w:semiHidden/>
+    <w:unhideWhenUsed/>
+    <w:rsid w:val="00F033A6"/>
+    <w:rPr>
+      <w:color w:val="605E5C"/>
+      <w:shd w:val="clear" w:color="auto" w:fill="E1DFDD"/>
+    </w:rPr>
+  </w:style>
+  <w:style w:type="paragraph" w:styleId="TOC2">
+    <w:name w:val="toc 2"/>
+    <w:basedOn w:val="Normal"/>
+    <w:next w:val="Normal"/>
+    <w:autoRedefine/>
+    <w:uiPriority w:val="39"/>
+    <w:unhideWhenUsed/>
+    <w:rsid w:val="00427F60"/>
+    <w:pPr>
+      <w:spacing w:after="100"/>
+      <w:ind w:left="240"/>
+    </w:pPr>
+  </w:style>
 </w:styles>
 </file>
 

</xml_diff>